<commit_message>
fix(esg-profile): complete anonymization scrub, externalize denylist, genericize skill, align fund fixture
</commit_message>
<xml_diff>
--- a/skills/esg-profile/demo/static/notes_scrubbed.docx
+++ b/skills/esg-profile/demo/static/notes_scrubbed.docx
@@ -90,7 +90,7 @@
           <w:rFonts w:ascii="Calibri" w:hAnsi="Calibri"/>
           <w:sz w:val="20"/>
         </w:rPr>
-        <w:t>Residential / Build-to-Rent (BTR), Spain</w:t>
+        <w:t>Residential / Build-to-Rent (BTR), Southern Europe</w:t>
       </w:r>
     </w:p>
     <w:p>
@@ -111,7 +111,7 @@
           <w:rFonts w:ascii="Calibri" w:hAnsi="Calibri"/>
           <w:sz w:val="20"/>
         </w:rPr>
-        <w:t>Sponsor Sierra (formerly Sponsor Sierra)</w:t>
+        <w:t>Sponsor Sierra</w:t>
       </w:r>
     </w:p>
     <w:p>
@@ -206,7 +206,7 @@
           <w:rFonts w:ascii="Calibri" w:hAnsi="Calibri"/>
           <w:sz w:val="20"/>
         </w:rPr>
-        <w:t>Spain (Southern Europe, Southern Europe, Southern Europe, Southern Europe, Southern Europe)</w:t>
+        <w:t>Southern Europe</w:t>
       </w:r>
     </w:p>
     <w:p>
@@ -226,7 +226,7 @@
           <w:rFonts w:ascii="Calibri" w:hAnsi="Calibri"/>
           <w:sz w:val="20"/>
         </w:rPr>
-        <w:t>Sponsor Sierra (formerly Sponsor Sierra)</w:t>
+        <w:t>Sponsor Sierra</w:t>
       </w:r>
     </w:p>
     <w:p>
@@ -1621,7 +1621,7 @@
           <w:rFonts w:ascii="Calibri" w:hAnsi="Calibri"/>
           <w:sz w:val="20"/>
         </w:rPr>
-        <w:t>BREEAM-Use certification via consultant Alma for assets where EPC upgrade not financially prudent</w:t>
+        <w:t>BREEAM-Use certification via a third-party consultant for assets where EPC upgrade not financially prudent</w:t>
       </w:r>
     </w:p>
     <w:p>
@@ -1905,7 +1905,7 @@
           <w:rFonts w:ascii="Calibri" w:hAnsi="Calibri"/>
           <w:sz w:val="20"/>
         </w:rPr>
-        <w:t>Subsidies available: e.g. Carabanchel I at 44%, Vallecas I at 39%</w:t>
+        <w:t>Subsidies available: e.g. Asset A at 44%, Asset B at 39%</w:t>
       </w:r>
     </w:p>
     <w:p>
@@ -3201,7 +3201,7 @@
           <w:b w:val="0"/>
           <w:color w:val="000000"/>
         </w:rPr>
-        <w:t>Physical Risk Exposure: Moderate — Wind, Heat, Drought (Spain residential context). Source: LPAC Slide Deck 2025.</w:t>
+        <w:t>Physical Risk Exposure: Moderate — Wind, Heat, Drought (Southern Europe residential context). Source: LPAC Slide Deck 2025.</w:t>
       </w:r>
     </w:p>
     <w:p>
@@ -3229,7 +3229,7 @@
           <w:rFonts w:ascii="Calibri" w:hAnsi="Calibri"/>
           <w:sz w:val="20"/>
         </w:rPr>
-        <w:t>Spanish energy efficiency regulations; EPC upgrade requirements</w:t>
+        <w:t>national energy-efficiency regulations; EPC upgrade requirements</w:t>
       </w:r>
     </w:p>
     <w:p>
@@ -3296,7 +3296,7 @@
         <w:pStyle w:val="Heading2"/>
       </w:pPr>
       <w:r>
-        <w:t>REGRESSION: Net Zero Policy — Net Zero Policy Development is actively in progress — Sponsor Sierra has committed to developing a formal policy and setting targets. Madison will push for a formalized commitment with a target year in 2026 engagement. However, status has not materially changed from prior year.</w:t>
+        <w:t>REGRESSION: Net Zero Policy — Net Zero Policy Development is actively in progress — Sponsor Sierra has committed to developing a formal policy and setting targets. the Investor will push for a formalized commitment with a target year in 2026 engagement. However, status has not materially changed from prior year.</w:t>
       </w:r>
     </w:p>
     <w:p>
@@ -3547,7 +3547,7 @@
           <w:rFonts w:ascii="Calibri" w:hAnsi="Calibri"/>
           <w:sz w:val="20"/>
         </w:rPr>
-        <w:t>BREEAM-Use certifications via Alma for assets where EPC upgrade not financially prudent</w:t>
+        <w:t>BREEAM-Use certifications via a third-party consultant for assets where EPC upgrade not financially prudent</w:t>
       </w:r>
     </w:p>
     <w:p>
@@ -4324,7 +4324,7 @@
                 <w:color w:val="CC8800"/>
                 <w:sz w:val="18"/>
               </w:rPr>
-              <w:t>Via consultant Alma for assets where EPC upgrade not financially prudent</w:t>
+              <w:t>Via a third-party consultant for assets where EPC upgrade not financially prudent</w:t>
             </w:r>
           </w:p>
         </w:tc>

</xml_diff>